<commit_message>
Glossary Update: Added Graph Theory definitions (Collider, Directed Path, Outcome)
</commit_message>
<xml_diff>
--- a/Thesis_Draft/Updates/2026-02-01_Status_Update.docx
+++ b/Thesis_Draft/Updates/2026-02-01_Status_Update.docx
@@ -133,176 +133,7 @@
         <w:t>Interview Follow-up:</w:t>
       </w:r>
       <w:r>
-        <w:t xml:space="preserve"> 15 people from the Jan 23 outreach haven't responded. I am doing the following:</w:t>
-      </w:r>
-    </w:p>
-    <w:p>
-      <w:pPr>
-        <w:ind w:left="360" w:hanging="360"/>
-      </w:pPr>
-      <w:r>
-        <w:t xml:space="preserve">• </w:t>
-      </w:r>
-      <w:r>
-        <w:rPr>
-          <w:b/>
-        </w:rPr>
-        <w:t>Research:</w:t>
-      </w:r>
-      <w:r>
-        <w:t xml:space="preserve"> Found alternative email addresses or direct contacts for them.</w:t>
-      </w:r>
-    </w:p>
-    <w:p>
-      <w:pPr>
-        <w:ind w:left="360" w:hanging="360"/>
-      </w:pPr>
-      <w:r>
-        <w:t xml:space="preserve">• </w:t>
-      </w:r>
-      <w:r>
-        <w:rPr>
-          <w:b/>
-        </w:rPr>
-        <w:t>Drafts:</w:t>
-      </w:r>
-      <w:r>
-        <w:t xml:space="preserve"> Prepared personalized emails to try again (sending Feb 4).</w:t>
-      </w:r>
-    </w:p>
-    <w:p>
-      <w:pPr>
-        <w:numPr>
-          <w:ilvl w:val="0"/>
-          <w:numId w:val="2"/>
-        </w:numPr>
-        <w:ind w:left="720" w:hanging="360"/>
-        <w:rPr/>
-      </w:pPr>
-      <w:r>
-        <w:rPr>
-          <w:rtl w:val="0"/>
-        </w:rPr>
-        <w:t xml:space="preserve">Confirmed that all students submitted complete final proposals to the Google Drive</w:t>
-      </w:r>
-    </w:p>
-    <w:p>
-      <w:pPr>
-        <w:numPr>
-          <w:ilvl w:val="0"/>
-          <w:numId w:val="2"/>
-        </w:numPr>
-        <w:ind w:left="720" w:hanging="360"/>
-        <w:rPr>
-          <w:u w:val="none"/>
-        </w:rPr>
-      </w:pPr>
-      <w:r>
-        <w:rPr>
-          <w:rtl w:val="0"/>
-        </w:rPr>
-        <w:t xml:space="preserve">Downloaded all final proposals to my desktop</w:t>
-      </w:r>
-    </w:p>
-    <w:p>
-      <w:pPr>
-        <w:numPr>
-          <w:ilvl w:val="0"/>
-          <w:numId w:val="2"/>
-        </w:numPr>
-        <w:ind w:left="720" w:hanging="360"/>
-        <w:rPr>
-          <w:u w:val="none"/>
-        </w:rPr>
-      </w:pPr>
-      <w:r>
-        <w:rPr>
-          <w:rtl w:val="0"/>
-        </w:rPr>
-        <w:t xml:space="preserve">Reviewed all proposals at a high level</w:t>
-      </w:r>
-    </w:p>
-    <w:p>
-      <w:pPr>
-        <w:numPr>
-          <w:ilvl w:val="0"/>
-          <w:numId w:val="2"/>
-        </w:numPr>
-        <w:ind w:left="720" w:hanging="360"/>
-        <w:rPr>
-          <w:u w:val="none"/>
-        </w:rPr>
-      </w:pPr>
-      <w:r>
-        <w:rPr>
-          <w:rtl w:val="0"/>
-        </w:rPr>
-        <w:t xml:space="preserve">Submitted final grades for first semester</w:t>
-      </w:r>
-    </w:p>
-    <w:p>
-      <w:pPr>
-        <w:numPr>
-          <w:ilvl w:val="0"/>
-          <w:numId w:val="2"/>
-        </w:numPr>
-        <w:ind w:left="720" w:hanging="360"/>
-        <w:rPr>
-          <w:u w:val="none"/>
-        </w:rPr>
-      </w:pPr>
-      <w:r>
-        <w:rPr>
-          <w:rtl w:val="0"/>
-        </w:rPr>
-        <w:t xml:space="preserve">Completed in-depth review 3 of 7 proposals and typed up comments</w:t>
-      </w:r>
-    </w:p>
-    <w:p>
-      <w:pPr>
-        <w:numPr>
-          <w:ilvl w:val="0"/>
-          <w:numId w:val="2"/>
-        </w:numPr>
-        <w:ind w:left="720" w:hanging="360"/>
-        <w:rPr>
-          <w:u w:val="none"/>
-        </w:rPr>
-      </w:pPr>
-      <w:r>
-        <w:rPr>
-          <w:rtl w:val="0"/>
-        </w:rPr>
-        <w:t xml:space="preserve">Created status update template</w:t>
-      </w:r>
-    </w:p>
-    <w:p>
-      <w:pPr>
-        <w:numPr>
-          <w:ilvl w:val="0"/>
-          <w:numId w:val="2"/>
-        </w:numPr>
-        <w:ind w:left="720" w:hanging="360"/>
-        <w:rPr>
-          <w:u w:val="none"/>
-        </w:rPr>
-      </w:pPr>
-      <w:r>
-        <w:rPr>
-          <w:rtl w:val="0"/>
-        </w:rPr>
-        <w:t xml:space="preserve">Distributed status update template</w:t>
-      </w:r>
-    </w:p>
-    <w:p>
-      <w:pPr>
-        <w:ind w:left="720" w:firstLine="0"/>
-        <w:rPr/>
-      </w:pPr>
-      <w:r>
-        <w:rPr>
-          <w:rtl w:val="0"/>
-        </w:rPr>
+        <w:t xml:space="preserve"> Found alternative contacts for the 15 non-responders and prepared personalized follow-ups (sending Feb 4).</w:t>
       </w:r>
     </w:p>
     <w:p>
@@ -341,36 +172,6 @@
     </w:p>
     <w:p>
       <w:pPr>
-        <w:numPr>
-          <w:ilvl w:val="0"/>
-          <w:numId w:val="1"/>
-        </w:numPr>
-        <w:ind w:left="720" w:hanging="360"/>
-        <w:rPr/>
-      </w:pPr>
-      <w:r>
-        <w:rPr>
-          <w:rtl w:val="0"/>
-        </w:rPr>
-        <w:t xml:space="preserve">Remind students about submitting the status updates</w:t>
-      </w:r>
-    </w:p>
-    <w:p>
-      <w:pPr>
-        <w:ind w:left="0" w:firstLine="0"/>
-        <w:rPr>
-          <w:b w:val="1"/>
-          <w:bCs w:val="1"/>
-        </w:rPr>
-      </w:pPr>
-      <w:r>
-        <w:rPr>
-          <w:rtl w:val="0"/>
-        </w:rPr>
-      </w:r>
-    </w:p>
-    <w:p>
-      <w:pPr>
         <w:ind w:left="0" w:firstLine="0"/>
         <w:rPr>
           <w:b w:val="1"/>
@@ -414,7 +215,7 @@
         <w:rPr>
           <w:b/>
         </w:rPr>
-        <w:t>Draft Methodology Chapter:</w:t>
+        <w:t>Draft Methodology:</w:t>
       </w:r>
       <w:r>
         <w:t xml:space="preserve"> Write up the data collection and cleaning steps.</w:t>
@@ -448,108 +249,10 @@
         <w:rPr>
           <w:b/>
         </w:rPr>
-        <w:t>Data Chapter:</w:t>
-      </w:r>
-      <w:r>
-        <w:t xml:space="preserve"> Draft the Data Chapter.</w:t>
-      </w:r>
-    </w:p>
-    <w:p>
-      <w:pPr>
-        <w:numPr>
-          <w:ilvl w:val="0"/>
-          <w:numId w:val="3"/>
-        </w:numPr>
-        <w:ind w:left="720" w:hanging="360"/>
-        <w:rPr/>
-      </w:pPr>
-      <w:r>
-        <w:rPr>
-          <w:rtl w:val="0"/>
-        </w:rPr>
-        <w:t xml:space="preserve">In-depth review of final 4 proposals</w:t>
-      </w:r>
-    </w:p>
-    <w:p>
-      <w:pPr>
-        <w:numPr>
-          <w:ilvl w:val="0"/>
-          <w:numId w:val="3"/>
-        </w:numPr>
-        <w:ind w:left="720" w:hanging="360"/>
-        <w:rPr>
-          <w:u w:val="none"/>
-        </w:rPr>
-      </w:pPr>
-      <w:r>
-        <w:rPr>
-          <w:rtl w:val="0"/>
-        </w:rPr>
-        <w:t xml:space="preserve">Send comments to all students</w:t>
-      </w:r>
-    </w:p>
-    <w:p>
-      <w:pPr>
-        <w:numPr>
-          <w:ilvl w:val="0"/>
-          <w:numId w:val="3"/>
-        </w:numPr>
-        <w:ind w:left="720" w:hanging="360"/>
-        <w:rPr>
-          <w:u w:val="none"/>
-        </w:rPr>
-      </w:pPr>
-      <w:r>
-        <w:rPr>
-          <w:rtl w:val="0"/>
-        </w:rPr>
-        <w:t xml:space="preserve">Review additional documents shared by Student A</w:t>
-      </w:r>
-    </w:p>
-    <w:p>
-      <w:pPr>
-        <w:numPr>
-          <w:ilvl w:val="0"/>
-          <w:numId w:val="3"/>
-        </w:numPr>
-        <w:ind w:left="720" w:hanging="360"/>
-        <w:rPr>
-          <w:u w:val="none"/>
-        </w:rPr>
-      </w:pPr>
-      <w:r>
-        <w:rPr>
-          <w:rtl w:val="0"/>
-        </w:rPr>
-        <w:t xml:space="preserve">Schedule second semester kickoff meeting (virtual)</w:t>
-      </w:r>
-    </w:p>
-    <w:p>
-      <w:pPr>
-        <w:numPr>
-          <w:ilvl w:val="0"/>
-          <w:numId w:val="3"/>
-        </w:numPr>
-        <w:ind w:left="720" w:hanging="360"/>
-        <w:rPr>
-          <w:u w:val="none"/>
-        </w:rPr>
-      </w:pPr>
-      <w:r>
-        <w:rPr>
-          <w:rtl w:val="0"/>
-        </w:rPr>
-        <w:t xml:space="preserve">Plan agenda for kickoff meeting</w:t>
-      </w:r>
-    </w:p>
-    <w:p>
-      <w:pPr>
-        <w:rPr/>
-      </w:pPr>
-      <w:r>
-        <w:rPr>
-          <w:rtl w:val="0"/>
-        </w:rPr>
+        <w:t>Initial Data Analysis:</w:t>
+      </w:r>
+      <w:r>
+        <w:t xml:space="preserve"> Begin drafting the Data Chapter findings.</w:t>
       </w:r>
     </w:p>
     <w:p>

</xml_diff>